<commit_message>
Padrão editorial: apresentação vira o documento-padrão + varredura de alinhamento em todo o repo
- 08-materiais/README §0: o padrão editorial registrado (entonação e termos da apresentação)
- Deck institucional: 25 dimensões → mergulho profundo; agentes sob medida → engenharia sob medida (V3m)
- Deck do Conselheiro: slide 7 sem 'firma nova' (honestidade mantida)
- Análise ABBA modelo: 25 dimensões removido + discurso de engenharia
- One-pager Conselheiro + spec assessment web: comercial@ → contato@
- Kit de presença e catálogo: descrições atualizadas para a versão vigente
- Régua do Revisor v1.1.0: primeiro-cafe (block), firma-nova (warn), 25-dimensoes (warn)
- V-log V3p

Co-Authored-By: Claude Fable 5 <noreply@anthropic.com>
Claude-Session: https://claude.ai/code/session_016RZJT8nVEB7u33HvjY5KvZ
</commit_message>
<xml_diff>
--- a/08-materiais/modelos/analise-abba-modelo.docx
+++ b/08-materiais/modelos/analise-abba-modelo.docx
@@ -1239,7 +1239,7 @@
           <w:sz w:val="22"/>
           <w:szCs w:val="22"/>
         </w:rPr>
-        <w:t xml:space="preserve">A Análise ABBA olha de fora. A Avaliação de Prontidão para IA olha de dentro — a empresa inteira, em 25 dimensões proprietárias:</w:t>
+        <w:t xml:space="preserve">A Análise ABBA olha de fora. A Avaliação de Prontidão para IA olha de dentro — a empresa inteira, do conselho à linha de frente, com o nosso método proprietário de análise:</w:t>
       </w:r>
     </w:p>
     <w:tbl>
@@ -1464,7 +1464,7 @@
                 <w:sz w:val="20"/>
                 <w:szCs w:val="20"/>
               </w:rPr>
-              <w:t xml:space="preserve">Pontuação de prontidão em 25 dimensões + lacunas de governança</w:t>
+              <w:t xml:space="preserve">Pontuação de prontidão da empresa inteira + lacunas de governança</w:t>
             </w:r>
           </w:p>
         </w:tc>
@@ -1516,7 +1516,7 @@
                 <w:sz w:val="20"/>
                 <w:szCs w:val="20"/>
               </w:rPr>
-              <w:t xml:space="preserve">Respostas — e um caminho recomendado de até 3 agentes de IA, com justificativa</w:t>
+              <w:t xml:space="preserve">Respostas — e um caminho recomendado de até 3 soluções de IA (arquitetura, integrações e agentes trabalhando em conjunto), com justificativa</w:t>
             </w:r>
           </w:p>
         </w:tc>

</xml_diff>